<commit_message>
modify:added more array problems and changed file structure
</commit_message>
<xml_diff>
--- a/04-arrays/problems/ARRAY PRACTICE PROBLEMS.docx
+++ b/04-arrays/problems/ARRAY PRACTICE PROBLEMS.docx
@@ -300,6 +300,1075 @@
         <w:t xml:space="preserve"> + j == size - 1)</w:t>
       </w:r>
     </w:p>
+    <w:p>
+      <w:pPr>
+        <w:spacing w:before="200"/>
+      </w:pPr>
+      <w:r/>
+    </w:p>
+    <w:p>
+      <w:pPr>
+        <w:spacing w:before="280" w:after="80"/>
+      </w:pPr>
+      <w:r>
+        <w:rPr>
+          <w:b/>
+          <w:color w:val="1F497D"/>
+          <w:sz w:val="22"/>
+        </w:rPr>
+        <w:t>---------- LEVEL 3 — 1D Array Operations ----------</w:t>
+      </w:r>
+    </w:p>
+    <w:p>
+      <w:pPr>
+        <w:spacing w:before="120" w:after="40"/>
+      </w:pPr>
+      <w:r>
+        <w:rPr>
+          <w:b w:val="0"/>
+          <w:sz w:val="22"/>
+        </w:rPr>
+        <w:t>21. Count how many times a given element occurs in an array.</w:t>
+      </w:r>
+    </w:p>
+    <w:p>
+      <w:pPr>
+        <w:spacing w:before="0" w:after="120"/>
+        <w:ind w:left="360"/>
+      </w:pPr>
+      <w:r>
+        <w:rPr>
+          <w:color w:val="606060"/>
+          <w:sz w:val="20"/>
+        </w:rPr>
+        <w:t>Topics: loops, counter variable, equality check</w:t>
+      </w:r>
+    </w:p>
+    <w:p>
+      <w:pPr>
+        <w:spacing w:before="120" w:after="40"/>
+      </w:pPr>
+      <w:r>
+        <w:rPr>
+          <w:b w:val="0"/>
+          <w:sz w:val="22"/>
+        </w:rPr>
+        <w:t>22. Find the sum of all even elements in an array.</w:t>
+      </w:r>
+    </w:p>
+    <w:p>
+      <w:pPr>
+        <w:spacing w:before="0" w:after="120"/>
+        <w:ind w:left="360"/>
+      </w:pPr>
+      <w:r>
+        <w:rPr>
+          <w:color w:val="606060"/>
+          <w:sz w:val="20"/>
+        </w:rPr>
+        <w:t>Topics: loops, modulus operator, accumulator</w:t>
+      </w:r>
+    </w:p>
+    <w:p>
+      <w:pPr>
+        <w:spacing w:before="120" w:after="40"/>
+      </w:pPr>
+      <w:r>
+        <w:rPr>
+          <w:b w:val="0"/>
+          <w:sz w:val="22"/>
+        </w:rPr>
+        <w:t>23. Find the second largest element in an array.</w:t>
+      </w:r>
+    </w:p>
+    <w:p>
+      <w:pPr>
+        <w:spacing w:before="0" w:after="120"/>
+        <w:ind w:left="360"/>
+      </w:pPr>
+      <w:r>
+        <w:rPr>
+          <w:color w:val="606060"/>
+          <w:sz w:val="20"/>
+        </w:rPr>
+        <w:t>Topics: loops, sorting logic, max tracking</w:t>
+      </w:r>
+    </w:p>
+    <w:p>
+      <w:pPr>
+        <w:spacing w:before="120" w:after="40"/>
+      </w:pPr>
+      <w:r>
+        <w:rPr>
+          <w:b w:val="0"/>
+          <w:sz w:val="22"/>
+        </w:rPr>
+        <w:t>24. Find the second smallest element in an array.</w:t>
+      </w:r>
+    </w:p>
+    <w:p>
+      <w:pPr>
+        <w:spacing w:before="0" w:after="120"/>
+        <w:ind w:left="360"/>
+      </w:pPr>
+      <w:r>
+        <w:rPr>
+          <w:color w:val="606060"/>
+          <w:sz w:val="20"/>
+        </w:rPr>
+        <w:t>Topics: loops, sorting logic, min tracking</w:t>
+      </w:r>
+    </w:p>
+    <w:p>
+      <w:pPr>
+        <w:spacing w:before="120" w:after="40"/>
+      </w:pPr>
+      <w:r>
+        <w:rPr>
+          <w:b w:val="0"/>
+          <w:sz w:val="22"/>
+        </w:rPr>
+        <w:t>25. Count positive, negative, and zero elements in an array.</w:t>
+      </w:r>
+    </w:p>
+    <w:p>
+      <w:pPr>
+        <w:spacing w:before="0" w:after="120"/>
+        <w:ind w:left="360"/>
+      </w:pPr>
+      <w:r>
+        <w:rPr>
+          <w:color w:val="606060"/>
+          <w:sz w:val="20"/>
+        </w:rPr>
+        <w:t>Topics: loops, if-else if, counter variables</w:t>
+      </w:r>
+    </w:p>
+    <w:p>
+      <w:pPr>
+        <w:spacing w:before="120" w:after="40"/>
+      </w:pPr>
+      <w:r>
+        <w:rPr>
+          <w:b w:val="0"/>
+          <w:sz w:val="22"/>
+        </w:rPr>
+        <w:t>26. Find the difference between the largest and smallest elements.</w:t>
+      </w:r>
+    </w:p>
+    <w:p>
+      <w:pPr>
+        <w:spacing w:before="0" w:after="120"/>
+        <w:ind w:left="360"/>
+      </w:pPr>
+      <w:r>
+        <w:rPr>
+          <w:color w:val="606060"/>
+          <w:sz w:val="20"/>
+        </w:rPr>
+        <w:t>Topics: loops, max/min tracking, subtraction</w:t>
+      </w:r>
+    </w:p>
+    <w:p>
+      <w:pPr>
+        <w:spacing w:before="120" w:after="40"/>
+      </w:pPr>
+      <w:r>
+        <w:rPr>
+          <w:b w:val="0"/>
+          <w:sz w:val="22"/>
+        </w:rPr>
+        <w:t>27. Find the sum of all odd elements in an array.</w:t>
+      </w:r>
+    </w:p>
+    <w:p>
+      <w:pPr>
+        <w:spacing w:before="0" w:after="120"/>
+        <w:ind w:left="360"/>
+      </w:pPr>
+      <w:r>
+        <w:rPr>
+          <w:color w:val="606060"/>
+          <w:sz w:val="20"/>
+        </w:rPr>
+        <w:t>Topics: loops, modulus operator, accumulator</w:t>
+      </w:r>
+    </w:p>
+    <w:p>
+      <w:pPr>
+        <w:spacing w:before="120" w:after="40"/>
+      </w:pPr>
+      <w:r>
+        <w:rPr>
+          <w:b w:val="0"/>
+          <w:sz w:val="22"/>
+        </w:rPr>
+        <w:t>28. Find the product of all elements in an array.</w:t>
+      </w:r>
+    </w:p>
+    <w:p>
+      <w:pPr>
+        <w:spacing w:before="0" w:after="120"/>
+        <w:ind w:left="360"/>
+      </w:pPr>
+      <w:r>
+        <w:rPr>
+          <w:color w:val="606060"/>
+          <w:sz w:val="20"/>
+        </w:rPr>
+        <w:t>Topics: loops, multiplication accumulator</w:t>
+      </w:r>
+    </w:p>
+    <w:p>
+      <w:pPr>
+        <w:spacing w:before="120" w:after="40"/>
+      </w:pPr>
+      <w:r>
+        <w:rPr>
+          <w:b w:val="0"/>
+          <w:sz w:val="22"/>
+        </w:rPr>
+        <w:t>29. Check whether an array is sorted in ascending order.</w:t>
+      </w:r>
+    </w:p>
+    <w:p>
+      <w:pPr>
+        <w:spacing w:before="0" w:after="120"/>
+        <w:ind w:left="360"/>
+      </w:pPr>
+      <w:r>
+        <w:rPr>
+          <w:color w:val="606060"/>
+          <w:sz w:val="20"/>
+        </w:rPr>
+        <w:t>Topics: loops, comparison, boolean flag</w:t>
+      </w:r>
+    </w:p>
+    <w:p>
+      <w:pPr>
+        <w:spacing w:before="120" w:after="40"/>
+      </w:pPr>
+      <w:r>
+        <w:rPr>
+          <w:b w:val="0"/>
+          <w:sz w:val="22"/>
+        </w:rPr>
+        <w:t>30. Check whether an array is a palindrome.</w:t>
+      </w:r>
+    </w:p>
+    <w:p>
+      <w:pPr>
+        <w:spacing w:before="0" w:after="120"/>
+        <w:ind w:left="360"/>
+      </w:pPr>
+      <w:r>
+        <w:rPr>
+          <w:color w:val="606060"/>
+          <w:sz w:val="20"/>
+        </w:rPr>
+        <w:t>Topics: two-pointer approach, loops, comparison</w:t>
+      </w:r>
+    </w:p>
+    <w:p/>
+    <w:p>
+      <w:pPr>
+        <w:spacing w:before="280" w:after="80"/>
+      </w:pPr>
+      <w:r>
+        <w:rPr>
+          <w:b/>
+          <w:color w:val="1F497D"/>
+          <w:sz w:val="22"/>
+        </w:rPr>
+        <w:t>---------- LEVEL 4 — Array Manipulation ----------</w:t>
+      </w:r>
+    </w:p>
+    <w:p>
+      <w:pPr>
+        <w:spacing w:before="120" w:after="40"/>
+      </w:pPr>
+      <w:r>
+        <w:rPr>
+          <w:b w:val="0"/>
+          <w:sz w:val="22"/>
+        </w:rPr>
+        <w:t>31. Reverse an array in-place (without creating another array).</w:t>
+      </w:r>
+    </w:p>
+    <w:p>
+      <w:pPr>
+        <w:spacing w:before="0" w:after="120"/>
+        <w:ind w:left="360"/>
+      </w:pPr>
+      <w:r>
+        <w:rPr>
+          <w:color w:val="606060"/>
+          <w:sz w:val="20"/>
+        </w:rPr>
+        <w:t>Topics: two-pointer, swap, in-place modification</w:t>
+      </w:r>
+    </w:p>
+    <w:p>
+      <w:pPr>
+        <w:spacing w:before="120" w:after="40"/>
+      </w:pPr>
+      <w:r>
+        <w:rPr>
+          <w:b w:val="0"/>
+          <w:sz w:val="22"/>
+        </w:rPr>
+        <w:t>32. Swap the largest and smallest elements in an array.</w:t>
+      </w:r>
+    </w:p>
+    <w:p>
+      <w:pPr>
+        <w:spacing w:before="0" w:after="120"/>
+        <w:ind w:left="360"/>
+      </w:pPr>
+      <w:r>
+        <w:rPr>
+          <w:color w:val="606060"/>
+          <w:sz w:val="20"/>
+        </w:rPr>
+        <w:t>Topics: index tracking, swap logic</w:t>
+      </w:r>
+    </w:p>
+    <w:p>
+      <w:pPr>
+        <w:spacing w:before="120" w:after="40"/>
+      </w:pPr>
+      <w:r>
+        <w:rPr>
+          <w:b w:val="0"/>
+          <w:sz w:val="22"/>
+        </w:rPr>
+        <w:t>33. Copy one array into another array.</w:t>
+      </w:r>
+    </w:p>
+    <w:p>
+      <w:pPr>
+        <w:spacing w:before="0" w:after="120"/>
+        <w:ind w:left="360"/>
+      </w:pPr>
+      <w:r>
+        <w:rPr>
+          <w:color w:val="606060"/>
+          <w:sz w:val="20"/>
+        </w:rPr>
+        <w:t>Topics: array traversal, assignment</w:t>
+      </w:r>
+    </w:p>
+    <w:p>
+      <w:pPr>
+        <w:spacing w:before="120" w:after="40"/>
+      </w:pPr>
+      <w:r>
+        <w:rPr>
+          <w:b w:val="0"/>
+          <w:sz w:val="22"/>
+        </w:rPr>
+        <w:t>34. Move all zeros to the end of the array (maintain relative order of non-zeros).</w:t>
+      </w:r>
+    </w:p>
+    <w:p>
+      <w:pPr>
+        <w:spacing w:before="0" w:after="120"/>
+        <w:ind w:left="360"/>
+      </w:pPr>
+      <w:r>
+        <w:rPr>
+          <w:color w:val="606060"/>
+          <w:sz w:val="20"/>
+        </w:rPr>
+        <w:t>Topics: two-pointer technique, in-place</w:t>
+      </w:r>
+    </w:p>
+    <w:p>
+      <w:pPr>
+        <w:spacing w:before="120" w:after="40"/>
+      </w:pPr>
+      <w:r>
+        <w:rPr>
+          <w:b w:val="0"/>
+          <w:sz w:val="22"/>
+        </w:rPr>
+        <w:t>35. Move all negative elements to the beginning of the array.</w:t>
+      </w:r>
+    </w:p>
+    <w:p>
+      <w:pPr>
+        <w:spacing w:before="0" w:after="120"/>
+        <w:ind w:left="360"/>
+      </w:pPr>
+      <w:r>
+        <w:rPr>
+          <w:color w:val="606060"/>
+          <w:sz w:val="20"/>
+        </w:rPr>
+        <w:t>Topics: partitioning, two-pointer</w:t>
+      </w:r>
+    </w:p>
+    <w:p>
+      <w:pPr>
+        <w:spacing w:before="120" w:after="40"/>
+      </w:pPr>
+      <w:r>
+        <w:rPr>
+          <w:b w:val="0"/>
+          <w:sz w:val="22"/>
+        </w:rPr>
+        <w:t>36. Separate even and odd elements: print evens first, then odds.</w:t>
+      </w:r>
+    </w:p>
+    <w:p>
+      <w:pPr>
+        <w:spacing w:before="0" w:after="120"/>
+        <w:ind w:left="360"/>
+      </w:pPr>
+      <w:r>
+        <w:rPr>
+          <w:color w:val="606060"/>
+          <w:sz w:val="20"/>
+        </w:rPr>
+        <w:t>Topics: two-pass, condition check</w:t>
+      </w:r>
+    </w:p>
+    <w:p>
+      <w:pPr>
+        <w:spacing w:before="120" w:after="40"/>
+      </w:pPr>
+      <w:r>
+        <w:rPr>
+          <w:b w:val="0"/>
+          <w:sz w:val="22"/>
+        </w:rPr>
+        <w:t>37. Insert an element at a given position in an array.</w:t>
+      </w:r>
+    </w:p>
+    <w:p>
+      <w:pPr>
+        <w:spacing w:before="0" w:after="120"/>
+        <w:ind w:left="360"/>
+      </w:pPr>
+      <w:r>
+        <w:rPr>
+          <w:color w:val="606060"/>
+          <w:sz w:val="20"/>
+        </w:rPr>
+        <w:t>Topics: shifting elements, index management</w:t>
+      </w:r>
+    </w:p>
+    <w:p>
+      <w:pPr>
+        <w:spacing w:before="120" w:after="40"/>
+      </w:pPr>
+      <w:r>
+        <w:rPr>
+          <w:b w:val="0"/>
+          <w:sz w:val="22"/>
+        </w:rPr>
+        <w:t>38. Delete an element from a given position in an array.</w:t>
+      </w:r>
+    </w:p>
+    <w:p>
+      <w:pPr>
+        <w:spacing w:before="0" w:after="120"/>
+        <w:ind w:left="360"/>
+      </w:pPr>
+      <w:r>
+        <w:rPr>
+          <w:color w:val="606060"/>
+          <w:sz w:val="20"/>
+        </w:rPr>
+        <w:t>Topics: shifting elements, index management</w:t>
+      </w:r>
+    </w:p>
+    <w:p/>
+    <w:p>
+      <w:pPr>
+        <w:spacing w:before="280" w:after="80"/>
+      </w:pPr>
+      <w:r>
+        <w:rPr>
+          <w:b/>
+          <w:color w:val="1F497D"/>
+          <w:sz w:val="22"/>
+        </w:rPr>
+        <w:t>---------- LEVEL 5 — Frequency &amp; Element Analysis ----------</w:t>
+      </w:r>
+    </w:p>
+    <w:p>
+      <w:pPr>
+        <w:spacing w:before="120" w:after="40"/>
+      </w:pPr>
+      <w:r>
+        <w:rPr>
+          <w:b w:val="0"/>
+          <w:sz w:val="22"/>
+        </w:rPr>
+        <w:t>39. Find the frequency of every element in an array.</w:t>
+      </w:r>
+    </w:p>
+    <w:p>
+      <w:pPr>
+        <w:spacing w:before="0" w:after="120"/>
+        <w:ind w:left="360"/>
+      </w:pPr>
+      <w:r>
+        <w:rPr>
+          <w:color w:val="606060"/>
+          <w:sz w:val="20"/>
+        </w:rPr>
+        <w:t>Topics: nested loops or boolean visited array, counting</w:t>
+      </w:r>
+    </w:p>
+    <w:p>
+      <w:pPr>
+        <w:spacing w:before="120" w:after="40"/>
+      </w:pPr>
+      <w:r>
+        <w:rPr>
+          <w:b w:val="0"/>
+          <w:sz w:val="22"/>
+        </w:rPr>
+        <w:t>40. Print all elements that occur more than once.</w:t>
+      </w:r>
+    </w:p>
+    <w:p>
+      <w:pPr>
+        <w:spacing w:before="0" w:after="120"/>
+        <w:ind w:left="360"/>
+      </w:pPr>
+      <w:r>
+        <w:rPr>
+          <w:color w:val="606060"/>
+          <w:sz w:val="20"/>
+        </w:rPr>
+        <w:t>Topics: frequency counting, visited array</w:t>
+      </w:r>
+    </w:p>
+    <w:p>
+      <w:pPr>
+        <w:spacing w:before="120" w:after="40"/>
+      </w:pPr>
+      <w:r>
+        <w:rPr>
+          <w:b w:val="0"/>
+          <w:sz w:val="22"/>
+        </w:rPr>
+        <w:t>41. Print all elements that occur exactly once.</w:t>
+      </w:r>
+    </w:p>
+    <w:p>
+      <w:pPr>
+        <w:spacing w:before="0" w:after="120"/>
+        <w:ind w:left="360"/>
+      </w:pPr>
+      <w:r>
+        <w:rPr>
+          <w:color w:val="606060"/>
+          <w:sz w:val="20"/>
+        </w:rPr>
+        <w:t>Topics: frequency counting, filter</w:t>
+      </w:r>
+    </w:p>
+    <w:p>
+      <w:pPr>
+        <w:spacing w:before="120" w:after="40"/>
+      </w:pPr>
+      <w:r>
+        <w:rPr>
+          <w:b w:val="0"/>
+          <w:sz w:val="22"/>
+        </w:rPr>
+        <w:t>42. Find the first repeating element in an array.</w:t>
+      </w:r>
+    </w:p>
+    <w:p>
+      <w:pPr>
+        <w:spacing w:before="0" w:after="120"/>
+        <w:ind w:left="360"/>
+      </w:pPr>
+      <w:r>
+        <w:rPr>
+          <w:color w:val="606060"/>
+          <w:sz w:val="20"/>
+        </w:rPr>
+        <w:t>Topics: inner/outer loops or hash set approach</w:t>
+      </w:r>
+    </w:p>
+    <w:p>
+      <w:pPr>
+        <w:spacing w:before="120" w:after="40"/>
+      </w:pPr>
+      <w:r>
+        <w:rPr>
+          <w:b w:val="0"/>
+          <w:sz w:val="22"/>
+        </w:rPr>
+        <w:t>43. Find the first non-repeating element in an array.</w:t>
+      </w:r>
+    </w:p>
+    <w:p>
+      <w:pPr>
+        <w:spacing w:before="0" w:after="120"/>
+        <w:ind w:left="360"/>
+      </w:pPr>
+      <w:r>
+        <w:rPr>
+          <w:color w:val="606060"/>
+          <w:sz w:val="20"/>
+        </w:rPr>
+        <w:t>Topics: frequency array, linear scan</w:t>
+      </w:r>
+    </w:p>
+    <w:p>
+      <w:pPr>
+        <w:spacing w:before="120" w:after="40"/>
+      </w:pPr>
+      <w:r>
+        <w:rPr>
+          <w:b w:val="0"/>
+          <w:sz w:val="22"/>
+        </w:rPr>
+        <w:t>44. Find the most frequently occurring element (mode).</w:t>
+      </w:r>
+    </w:p>
+    <w:p>
+      <w:pPr>
+        <w:spacing w:before="0" w:after="120"/>
+        <w:ind w:left="360"/>
+      </w:pPr>
+      <w:r>
+        <w:rPr>
+          <w:color w:val="606060"/>
+          <w:sz w:val="20"/>
+        </w:rPr>
+        <w:t>Topics: frequency counting, max frequency tracking</w:t>
+      </w:r>
+    </w:p>
+    <w:p>
+      <w:pPr>
+        <w:spacing w:before="120" w:after="40"/>
+      </w:pPr>
+      <w:r>
+        <w:rPr>
+          <w:b w:val="0"/>
+          <w:sz w:val="22"/>
+        </w:rPr>
+        <w:t>45. Check whether all elements in an array are unique.</w:t>
+      </w:r>
+    </w:p>
+    <w:p>
+      <w:pPr>
+        <w:spacing w:before="0" w:after="120"/>
+        <w:ind w:left="360"/>
+      </w:pPr>
+      <w:r>
+        <w:rPr>
+          <w:color w:val="606060"/>
+          <w:sz w:val="20"/>
+        </w:rPr>
+        <w:t>Topics: nested loops or boolean array, flag</w:t>
+      </w:r>
+    </w:p>
+    <w:p/>
+    <w:p>
+      <w:pPr>
+        <w:spacing w:before="280" w:after="80"/>
+      </w:pPr>
+      <w:r>
+        <w:rPr>
+          <w:b/>
+          <w:color w:val="1F497D"/>
+          <w:sz w:val="22"/>
+        </w:rPr>
+        <w:t>---------- LEVEL 5B — Two-Array Problems ----------</w:t>
+      </w:r>
+    </w:p>
+    <w:p>
+      <w:pPr>
+        <w:spacing w:before="120" w:after="40"/>
+      </w:pPr>
+      <w:r>
+        <w:rPr>
+          <w:b w:val="0"/>
+          <w:sz w:val="22"/>
+        </w:rPr>
+        <w:t>46. Merge two arrays into a single array.</w:t>
+      </w:r>
+    </w:p>
+    <w:p>
+      <w:pPr>
+        <w:spacing w:before="0" w:after="120"/>
+        <w:ind w:left="360"/>
+      </w:pPr>
+      <w:r>
+        <w:rPr>
+          <w:color w:val="606060"/>
+          <w:sz w:val="20"/>
+        </w:rPr>
+        <w:t>Topics: array copying, System.arraycopy or manual loop</w:t>
+      </w:r>
+    </w:p>
+    <w:p>
+      <w:pPr>
+        <w:spacing w:before="120" w:after="40"/>
+      </w:pPr>
+      <w:r>
+        <w:rPr>
+          <w:b w:val="0"/>
+          <w:sz w:val="22"/>
+        </w:rPr>
+        <w:t>47. Find common elements between two arrays.</w:t>
+      </w:r>
+    </w:p>
+    <w:p>
+      <w:pPr>
+        <w:spacing w:before="0" w:after="120"/>
+        <w:ind w:left="360"/>
+      </w:pPr>
+      <w:r>
+        <w:rPr>
+          <w:color w:val="606060"/>
+          <w:sz w:val="20"/>
+        </w:rPr>
+        <w:t>Topics: nested loops, contains check</w:t>
+      </w:r>
+    </w:p>
+    <w:p>
+      <w:pPr>
+        <w:spacing w:before="120" w:after="40"/>
+      </w:pPr>
+      <w:r>
+        <w:rPr>
+          <w:b w:val="0"/>
+          <w:sz w:val="22"/>
+        </w:rPr>
+        <w:t>48. Find elements present in the first array but not in the second.</w:t>
+      </w:r>
+    </w:p>
+    <w:p>
+      <w:pPr>
+        <w:spacing w:before="0" w:after="120"/>
+        <w:ind w:left="360"/>
+      </w:pPr>
+      <w:r>
+        <w:rPr>
+          <w:color w:val="606060"/>
+          <w:sz w:val="20"/>
+        </w:rPr>
+        <w:t>Topics: nested loops, membership check, boolean flag</w:t>
+      </w:r>
+    </w:p>
+    <w:p>
+      <w:pPr>
+        <w:spacing w:before="120" w:after="40"/>
+      </w:pPr>
+      <w:r>
+        <w:rPr>
+          <w:b w:val="0"/>
+          <w:sz w:val="22"/>
+        </w:rPr>
+        <w:t>49. Check whether two arrays are equal (same elements in same order).</w:t>
+      </w:r>
+    </w:p>
+    <w:p>
+      <w:pPr>
+        <w:spacing w:before="0" w:after="120"/>
+        <w:ind w:left="360"/>
+      </w:pPr>
+      <w:r>
+        <w:rPr>
+          <w:color w:val="606060"/>
+          <w:sz w:val="20"/>
+        </w:rPr>
+        <w:t>Topics: length check, element-wise comparison</w:t>
+      </w:r>
+    </w:p>
+    <w:p>
+      <w:pPr>
+        <w:spacing w:before="120" w:after="40"/>
+      </w:pPr>
+      <w:r>
+        <w:rPr>
+          <w:b w:val="0"/>
+          <w:sz w:val="22"/>
+        </w:rPr>
+        <w:t>50. Find the sum of corresponding elements of two arrays.</w:t>
+      </w:r>
+    </w:p>
+    <w:p>
+      <w:pPr>
+        <w:spacing w:before="0" w:after="120"/>
+        <w:ind w:left="360"/>
+      </w:pPr>
+      <w:r>
+        <w:rPr>
+          <w:color w:val="606060"/>
+          <w:sz w:val="20"/>
+        </w:rPr>
+        <w:t>Topics: parallel traversal, addition</w:t>
+      </w:r>
+    </w:p>
+    <w:p/>
+    <w:p>
+      <w:pPr>
+        <w:spacing w:before="280" w:after="80"/>
+      </w:pPr>
+      <w:r>
+        <w:rPr>
+          <w:b/>
+          <w:color w:val="1F497D"/>
+          <w:sz w:val="22"/>
+        </w:rPr>
+        <w:t>---------- LEVEL 6 — Searching &amp; Missing Elements ----------</w:t>
+      </w:r>
+    </w:p>
+    <w:p>
+      <w:pPr>
+        <w:spacing w:before="120" w:after="40"/>
+      </w:pPr>
+      <w:r>
+        <w:rPr>
+          <w:b w:val="0"/>
+          <w:sz w:val="22"/>
+        </w:rPr>
+        <w:t>51. Find the missing number from 1 to N in an array of N-1 elements.</w:t>
+        <w:br/>
+        <w:t xml:space="preserve">    Example: arr = {1, 2, 3, 5}  →  Output: 4</w:t>
+      </w:r>
+    </w:p>
+    <w:p>
+      <w:pPr>
+        <w:spacing w:before="0" w:after="120"/>
+        <w:ind w:left="360"/>
+      </w:pPr>
+      <w:r>
+        <w:rPr>
+          <w:color w:val="606060"/>
+          <w:sz w:val="20"/>
+        </w:rPr>
+        <w:t>Topics: sum formula: N*(N+1)/2, subtraction</w:t>
+      </w:r>
+    </w:p>
+    <w:p>
+      <w:pPr>
+        <w:spacing w:before="120" w:after="40"/>
+      </w:pPr>
+      <w:r>
+        <w:rPr>
+          <w:b w:val="0"/>
+          <w:sz w:val="22"/>
+        </w:rPr>
+        <w:t>52. Find all missing numbers from 1 to N in an array.</w:t>
+      </w:r>
+    </w:p>
+    <w:p>
+      <w:pPr>
+        <w:spacing w:before="0" w:after="120"/>
+        <w:ind w:left="360"/>
+      </w:pPr>
+      <w:r>
+        <w:rPr>
+          <w:color w:val="606060"/>
+          <w:sz w:val="20"/>
+        </w:rPr>
+        <w:t>Topics: boolean visited array, loop from 1 to N</w:t>
+      </w:r>
+    </w:p>
+    <w:p>
+      <w:pPr>
+        <w:spacing w:before="120" w:after="40"/>
+      </w:pPr>
+      <w:r>
+        <w:rPr>
+          <w:b w:val="0"/>
+          <w:sz w:val="22"/>
+        </w:rPr>
+        <w:t>53. Find the element that appears only once when every other element appears exactly twice.</w:t>
+      </w:r>
+    </w:p>
+    <w:p>
+      <w:pPr>
+        <w:spacing w:before="0" w:after="120"/>
+        <w:ind w:left="360"/>
+      </w:pPr>
+      <w:r>
+        <w:rPr>
+          <w:color w:val="606060"/>
+          <w:sz w:val="20"/>
+        </w:rPr>
+        <w:t>Topics: XOR trick or frequency array</w:t>
+      </w:r>
+    </w:p>
+    <w:p>
+      <w:pPr>
+        <w:spacing w:before="120" w:after="40"/>
+      </w:pPr>
+      <w:r>
+        <w:rPr>
+          <w:b w:val="0"/>
+          <w:sz w:val="22"/>
+        </w:rPr>
+        <w:t>54. Find an element that appears more than once in an array.</w:t>
+      </w:r>
+    </w:p>
+    <w:p>
+      <w:pPr>
+        <w:spacing w:before="0" w:after="120"/>
+        <w:ind w:left="360"/>
+      </w:pPr>
+      <w:r>
+        <w:rPr>
+          <w:color w:val="606060"/>
+          <w:sz w:val="20"/>
+        </w:rPr>
+        <w:t>Topics: nested loops or frequency array</w:t>
+      </w:r>
+    </w:p>
+    <w:p/>
+    <w:p>
+      <w:pPr>
+        <w:spacing w:before="280" w:after="80"/>
+      </w:pPr>
+      <w:r>
+        <w:rPr>
+          <w:b/>
+          <w:color w:val="1F497D"/>
+          <w:sz w:val="22"/>
+        </w:rPr>
+        <w:t>---------- LEVEL 7 — Pair Problems ----------</w:t>
+      </w:r>
+    </w:p>
+    <w:p>
+      <w:pPr>
+        <w:spacing w:before="120" w:after="40"/>
+      </w:pPr>
+      <w:r>
+        <w:rPr>
+          <w:b w:val="0"/>
+          <w:sz w:val="22"/>
+        </w:rPr>
+        <w:t>55. Print all possible pairs in an array.</w:t>
+      </w:r>
+    </w:p>
+    <w:p>
+      <w:pPr>
+        <w:spacing w:before="0" w:after="120"/>
+        <w:ind w:left="360"/>
+      </w:pPr>
+      <w:r>
+        <w:rPr>
+          <w:color w:val="606060"/>
+          <w:sz w:val="20"/>
+        </w:rPr>
+        <w:t>Topics: nested loops, pair enumeration</w:t>
+      </w:r>
+    </w:p>
+    <w:p>
+      <w:pPr>
+        <w:spacing w:before="120" w:after="40"/>
+      </w:pPr>
+      <w:r>
+        <w:rPr>
+          <w:b w:val="0"/>
+          <w:sz w:val="22"/>
+        </w:rPr>
+        <w:t>56. Find whether any two elements have a given sum (target).</w:t>
+        <w:br/>
+        <w:t xml:space="preserve">    Example: arr = {2, 7, 11, 15}, target = 9  →  Output: 2 + 7 = 9</w:t>
+      </w:r>
+    </w:p>
+    <w:p>
+      <w:pPr>
+        <w:spacing w:before="0" w:after="120"/>
+        <w:ind w:left="360"/>
+      </w:pPr>
+      <w:r>
+        <w:rPr>
+          <w:color w:val="606060"/>
+          <w:sz w:val="20"/>
+        </w:rPr>
+        <w:t>Topics: nested loops or two-pointer after sorting</w:t>
+      </w:r>
+    </w:p>
+    <w:p>
+      <w:pPr>
+        <w:spacing w:before="120" w:after="40"/>
+      </w:pPr>
+      <w:r>
+        <w:rPr>
+          <w:b w:val="0"/>
+          <w:sz w:val="22"/>
+        </w:rPr>
+        <w:t>57. Find all pairs whose sum equals a given target.</w:t>
+      </w:r>
+    </w:p>
+    <w:p>
+      <w:pPr>
+        <w:spacing w:before="0" w:after="120"/>
+        <w:ind w:left="360"/>
+      </w:pPr>
+      <w:r>
+        <w:rPr>
+          <w:color w:val="606060"/>
+          <w:sz w:val="20"/>
+        </w:rPr>
+        <w:t>Topics: nested loops, pair enumeration, sum check</w:t>
+      </w:r>
+    </w:p>
+    <w:p>
+      <w:pPr>
+        <w:spacing w:before="120" w:after="40"/>
+      </w:pPr>
+      <w:r>
+        <w:rPr>
+          <w:b w:val="0"/>
+          <w:sz w:val="22"/>
+        </w:rPr>
+        <w:t>58. Find the pair with the maximum sum.</w:t>
+      </w:r>
+    </w:p>
+    <w:p>
+      <w:pPr>
+        <w:spacing w:before="0" w:after="120"/>
+        <w:ind w:left="360"/>
+      </w:pPr>
+      <w:r>
+        <w:rPr>
+          <w:color w:val="606060"/>
+          <w:sz w:val="20"/>
+        </w:rPr>
+        <w:t>Topics: nested loops, max sum tracking</w:t>
+      </w:r>
+    </w:p>
+    <w:p>
+      <w:pPr>
+        <w:spacing w:before="120" w:after="40"/>
+      </w:pPr>
+      <w:r>
+        <w:rPr>
+          <w:b w:val="0"/>
+          <w:sz w:val="22"/>
+        </w:rPr>
+        <w:t>59. Find the pair with the minimum absolute difference.</w:t>
+      </w:r>
+    </w:p>
+    <w:p>
+      <w:pPr>
+        <w:spacing w:before="0" w:after="120"/>
+        <w:ind w:left="360"/>
+      </w:pPr>
+      <w:r>
+        <w:rPr>
+          <w:color w:val="606060"/>
+          <w:sz w:val="20"/>
+        </w:rPr>
+        <w:t>Topics: nested loops or sorting + adjacent pairs</w:t>
+      </w:r>
+    </w:p>
+    <w:p/>
     <w:sectPr>
       <w:pgSz w:w="11906" w:h="16838"/>
       <w:pgMar w:top="1440" w:right="1440" w:bottom="1440" w:left="1440" w:header="708" w:footer="708" w:gutter="0"/>

</xml_diff>